<commit_message>
Capturas: modal del Comparador, panel de horarios abierto y recuadros numerados
- 18/19: modal del Comparador de Dealers (fase, form N/M, dealer en curso),
  capturado simulando el runner: no abre navegador ni toca formularios reales.
- 08/15: el panel de Programacion ahora se ve con un dia abierto (grilla de 15 min,
  chips de horarios y "aplicar a otros dias").
- Las 5 capturas de pestañas llevan recuadros rojos numerados que se corresponden
  con el paso a paso del README.
- README + Guia_de_Uso_Osocio.docx actualizados (19 imagenes).
</commit_message>
<xml_diff>
--- a/Guia_de_Uso_Osocio.docx
+++ b/Guia_de_Uso_Osocio.docx
@@ -246,6 +246,41 @@
       </w:r>
       <w:r>
         <w:t xml:space="preserve"> (ver más abajo). La app recuerda casi toda tu configuración entre una sesión y otra — no hace falta reconfigurar todo cada vez que la abrís (ver "La app recuerda tu configuración" en la pestaña Envío de Leads).</w:t>
+      </w:r>
+    </w:p>
+    <w:p>
+      <w:pPr>
+        <w:ind w:left="432"/>
+      </w:pPr>
+      <w:r>
+        <w:rPr>
+          <w:b/>
+          <w:i/>
+          <w:color w:val="555555"/>
+        </w:rPr>
+        <w:t>Cómo leer las capturas:</w:t>
+      </w:r>
+      <w:r>
+        <w:rPr>
+          <w:i/>
+          <w:color w:val="555555"/>
+        </w:rPr>
+        <w:t xml:space="preserve"> en las imágenes de cada pestaña vas a ver </w:t>
+      </w:r>
+      <w:r>
+        <w:rPr>
+          <w:b/>
+          <w:i/>
+          <w:color w:val="555555"/>
+        </w:rPr>
+        <w:t>recuadros rojos numerados</w:t>
+      </w:r>
+      <w:r>
+        <w:rPr>
+          <w:i/>
+          <w:color w:val="555555"/>
+        </w:rPr>
+        <w:t xml:space="preserve"> (①, ②, ③…). Cada número se corresponde con el punto del mismo número en el "Paso a paso" que está debajo de la imagen, así ubicás en pantalla exactamente el control del que se habla.</w:t>
       </w:r>
     </w:p>
     <w:p>
@@ -2268,7 +2303,7 @@
       <w:r>
         <w:drawing>
           <wp:inline xmlns:a="http://schemas.openxmlformats.org/drawingml/2006/main" xmlns:pic="http://schemas.openxmlformats.org/drawingml/2006/picture">
-            <wp:extent cx="5669280" cy="3352270"/>
+            <wp:extent cx="5669280" cy="4042443"/>
             <wp:docPr id="9" name="Picture 9"/>
             <wp:cNvGraphicFramePr>
               <a:graphicFrameLocks noChangeAspect="1"/>
@@ -2289,7 +2324,7 @@
                   <pic:spPr>
                     <a:xfrm>
                       <a:off x="0" y="0"/>
-                      <a:ext cx="5669280" cy="3352270"/>
+                      <a:ext cx="5669280" cy="4042443"/>
                     </a:xfrm>
                     <a:prstGeom prst="rect"/>
                   </pic:spPr>
@@ -2334,7 +2369,7 @@
       <w:r>
         <w:drawing>
           <wp:inline xmlns:a="http://schemas.openxmlformats.org/drawingml/2006/main" xmlns:pic="http://schemas.openxmlformats.org/drawingml/2006/picture">
-            <wp:extent cx="5669280" cy="3746655"/>
+            <wp:extent cx="5669280" cy="4042443"/>
             <wp:docPr id="10" name="Picture 10"/>
             <wp:cNvGraphicFramePr>
               <a:graphicFrameLocks noChangeAspect="1"/>
@@ -2355,7 +2390,7 @@
                   <pic:spPr>
                     <a:xfrm>
                       <a:off x="0" y="0"/>
-                      <a:ext cx="5669280" cy="3746655"/>
+                      <a:ext cx="5669280" cy="4042443"/>
                     </a:xfrm>
                     <a:prstGeom prst="rect"/>
                   </pic:spPr>
@@ -4249,6 +4284,201 @@
       </w:r>
       <w:r>
         <w:t>.</w:t>
+      </w:r>
+    </w:p>
+    <w:p>
+      <w:pPr>
+        <w:pStyle w:val="Heading3"/>
+      </w:pPr>
+      <w:r>
+        <w:t>El modal del Comparador</w:t>
+      </w:r>
+    </w:p>
+    <w:p>
+      <w:r>
+        <w:t>Igual que en Envío de Leads, la comparación corre dentro de un modal que bloquea la ventana de atrás:</w:t>
+      </w:r>
+    </w:p>
+    <w:p>
+      <w:pPr>
+        <w:jc w:val="center"/>
+      </w:pPr>
+      <w:r>
+        <w:drawing>
+          <wp:inline xmlns:a="http://schemas.openxmlformats.org/drawingml/2006/main" xmlns:pic="http://schemas.openxmlformats.org/drawingml/2006/picture">
+            <wp:extent cx="5669280" cy="3697357"/>
+            <wp:docPr id="18" name="Picture 18"/>
+            <wp:cNvGraphicFramePr>
+              <a:graphicFrameLocks noChangeAspect="1"/>
+            </wp:cNvGraphicFramePr>
+            <a:graphic>
+              <a:graphicData uri="http://schemas.openxmlformats.org/drawingml/2006/picture">
+                <pic:pic>
+                  <pic:nvPicPr>
+                    <pic:cNvPr id="0" name="18_modal_comparador.png"/>
+                    <pic:cNvPicPr/>
+                  </pic:nvPicPr>
+                  <pic:blipFill>
+                    <a:blip r:embed="rId26"/>
+                    <a:stretch>
+                      <a:fillRect/>
+                    </a:stretch>
+                  </pic:blipFill>
+                  <pic:spPr>
+                    <a:xfrm>
+                      <a:off x="0" y="0"/>
+                      <a:ext cx="5669280" cy="3697357"/>
+                    </a:xfrm>
+                    <a:prstGeom prst="rect"/>
+                  </pic:spPr>
+                </pic:pic>
+              </a:graphicData>
+            </a:graphic>
+          </wp:inline>
+        </w:drawing>
+      </w:r>
+    </w:p>
+    <w:p>
+      <w:pPr>
+        <w:jc w:val="center"/>
+      </w:pPr>
+      <w:r>
+        <w:rPr>
+          <w:i/>
+          <w:color w:val="777777"/>
+          <w:sz w:val="18"/>
+        </w:rPr>
+        <w:t>Modal del Comparador</w:t>
+      </w:r>
+    </w:p>
+    <w:p>
+      <w:pPr>
+        <w:pStyle w:val="ListBullet"/>
+      </w:pPr>
+      <w:r>
+        <w:rPr>
+          <w:b/>
+        </w:rPr>
+        <w:t>Comparando dealers… / país</w:t>
+      </w:r>
+      <w:r>
+        <w:t>: arriba te recuerda sobre qué mercado está corriendo.</w:t>
+      </w:r>
+    </w:p>
+    <w:p>
+      <w:pPr>
+        <w:pStyle w:val="ListBullet"/>
+      </w:pPr>
+      <w:r>
+        <w:rPr>
+          <w:b/>
+        </w:rPr>
+        <w:t>La barra de progreso</w:t>
+      </w:r>
+      <w:r>
+        <w:t xml:space="preserve"> avanza sobre el total de dealers del Excel.</w:t>
+      </w:r>
+    </w:p>
+    <w:p>
+      <w:pPr>
+        <w:pStyle w:val="ListBullet"/>
+      </w:pPr>
+      <w:r>
+        <w:rPr>
+          <w:b/>
+        </w:rPr>
+        <w:t>La línea de estado</w:t>
+      </w:r>
+      <w:r>
+        <w:t xml:space="preserve"> de abajo es la más útil: te dice exactamente en qué está, con este formato → </w:t>
+      </w:r>
+      <w:r>
+        <w:rPr>
+          <w:rFonts w:ascii="Consolas" w:hAnsi="Consolas"/>
+          <w:color w:val="C0392B"/>
+          <w:sz w:val="19"/>
+        </w:rPr>
+        <w:t>2/3 — [Fase 1 - Form 1/5] Buscando extras 2/3 (región/ciudad): Montevideo / Montevideo</w:t>
+      </w:r>
+      <w:r>
+        <w:t>. Ahí leés la fase (1 = comparación, 2 = capturas), qué formulario de la lista está procesando (</w:t>
+      </w:r>
+      <w:r>
+        <w:rPr>
+          <w:rFonts w:ascii="Consolas" w:hAnsi="Consolas"/>
+          <w:color w:val="C0392B"/>
+          <w:sz w:val="19"/>
+        </w:rPr>
+        <w:t>Form 1/5</w:t>
+      </w:r>
+      <w:r>
+        <w:t>), y qué dealer o combinación región/ciudad está mirando en ese momento.</w:t>
+      </w:r>
+    </w:p>
+    <w:p>
+      <w:pPr>
+        <w:pStyle w:val="ListBullet"/>
+      </w:pPr>
+      <w:r>
+        <w:rPr>
+          <w:b/>
+        </w:rPr>
+        <w:t>Detener</w:t>
+      </w:r>
+      <w:r>
+        <w:t xml:space="preserve"> corta la corrida. Como el Excel de resultados se guarda al terminar la Fase 1, si frenás durante la Fase 2 (capturas) igual te queda el reporte.</w:t>
+      </w:r>
+    </w:p>
+    <w:p>
+      <w:pPr>
+        <w:jc w:val="center"/>
+      </w:pPr>
+      <w:r>
+        <w:drawing>
+          <wp:inline xmlns:a="http://schemas.openxmlformats.org/drawingml/2006/main" xmlns:pic="http://schemas.openxmlformats.org/drawingml/2006/picture">
+            <wp:extent cx="5669280" cy="3746655"/>
+            <wp:docPr id="19" name="Picture 19"/>
+            <wp:cNvGraphicFramePr>
+              <a:graphicFrameLocks noChangeAspect="1"/>
+            </wp:cNvGraphicFramePr>
+            <a:graphic>
+              <a:graphicData uri="http://schemas.openxmlformats.org/drawingml/2006/picture">
+                <pic:pic>
+                  <pic:nvPicPr>
+                    <pic:cNvPr id="0" name="19_modal_comparador_sobre_app.png"/>
+                    <pic:cNvPicPr/>
+                  </pic:nvPicPr>
+                  <pic:blipFill>
+                    <a:blip r:embed="rId27"/>
+                    <a:stretch>
+                      <a:fillRect/>
+                    </a:stretch>
+                  </pic:blipFill>
+                  <pic:spPr>
+                    <a:xfrm>
+                      <a:off x="0" y="0"/>
+                      <a:ext cx="5669280" cy="3746655"/>
+                    </a:xfrm>
+                    <a:prstGeom prst="rect"/>
+                  </pic:spPr>
+                </pic:pic>
+              </a:graphicData>
+            </a:graphic>
+          </wp:inline>
+        </w:drawing>
+      </w:r>
+    </w:p>
+    <w:p>
+      <w:pPr>
+        <w:jc w:val="center"/>
+      </w:pPr>
+      <w:r>
+        <w:rPr>
+          <w:i/>
+          <w:color w:val="777777"/>
+          <w:sz w:val="18"/>
+        </w:rPr>
+        <w:t>Modal del Comparador sobre la app</w:t>
       </w:r>
     </w:p>
     <w:p>

</xml_diff>

<commit_message>
Fix: el modal de ejecucion solo mostraba 4 mercados
El alto del modal estaba fijo en 370px, asi que a partir del 5o mercado las barras
quedaban fuera de la ventana. Ahora el alto se calcula segun cuantos mercados hay
(tope: 85% del alto de pantalla) y el area de mercados tiene scroll, asi que con
muchos mercados en una pantalla chica aparece la barra lateral en vez de recortarse.

Aplica igual a Envio de Leads y a Programacion de Tests (comparten el modal). El
del Comparador de Dealers no se ve afectado: tiene una sola barra, no una por mercado.

Verificado con 5 mercados (se ven los 5) y con 9 en una pantalla de 600px (scroll).
</commit_message>
<xml_diff>
--- a/Guia_de_Uso_Osocio.docx
+++ b/Guia_de_Uso_Osocio.docx
@@ -1246,7 +1246,7 @@
       <w:r>
         <w:drawing>
           <wp:inline xmlns:a="http://schemas.openxmlformats.org/drawingml/2006/main" xmlns:pic="http://schemas.openxmlformats.org/drawingml/2006/picture">
-            <wp:extent cx="5669280" cy="4033911"/>
+            <wp:extent cx="5669280" cy="5342206"/>
             <wp:docPr id="6" name="Picture 6"/>
             <wp:cNvGraphicFramePr>
               <a:graphicFrameLocks noChangeAspect="1"/>
@@ -1267,7 +1267,7 @@
                   <pic:spPr>
                     <a:xfrm>
                       <a:off x="0" y="0"/>
-                      <a:ext cx="5669280" cy="4033911"/>
+                      <a:ext cx="5669280" cy="5342206"/>
                     </a:xfrm>
                     <a:prstGeom prst="rect"/>
                   </pic:spPr>

</xml_diff>

<commit_message>
Docs: seccion de checkbox por Excel en la Guia de Uso (docx)
Misma seccion que el README, dentro de 'Pestana: Envio de Leads'.
</commit_message>
<xml_diff>
--- a/Guia_de_Uso_Osocio.docx
+++ b/Guia_de_Uso_Osocio.docx
@@ -1224,6 +1224,111 @@
           <w:color w:val="555555"/>
         </w:rPr>
         <w:t>.</w:t>
+      </w:r>
+    </w:p>
+    <w:p>
+      <w:pPr>
+        <w:pStyle w:val="Heading3"/>
+      </w:pPr>
+      <w:r>
+        <w:t>Columnas especiales del Excel: marcar o no un checkbox</w:t>
+      </w:r>
+    </w:p>
+    <w:p>
+      <w:r>
+        <w:t>Por defecto la app marca todos los checkboxes que reconoce (terminos, privacidad, y cualquier otro que el formulario declare como obligatorio). Si un formulario tiene un checkbox opcional y queres decidir vos si se tilda o no, agrega una columna al Excel:</w:t>
+      </w:r>
+    </w:p>
+    <w:p>
+      <w:pPr>
+        <w:pStyle w:val="ListBullet"/>
+      </w:pPr>
+      <w:r>
+        <w:rPr>
+          <w:b/>
+        </w:rPr>
+        <w:t xml:space="preserve">El encabezado de la columna </w:t>
+      </w:r>
+      <w:r>
+        <w:t>= el atributo name del checkbox (o su id), tal cual figura en el HTML del formulario.</w:t>
+      </w:r>
+    </w:p>
+    <w:p>
+      <w:pPr>
+        <w:pStyle w:val="ListBullet"/>
+      </w:pPr>
+      <w:r>
+        <w:rPr>
+          <w:b/>
+        </w:rPr>
+        <w:t xml:space="preserve">El valor de la celda </w:t>
+      </w:r>
+      <w:r>
+        <w:t>= SI o NO.</w:t>
+      </w:r>
+    </w:p>
+    <w:p>
+      <w:r>
+        <w:t>Ejemplo: los formularios RAQ de Brasil tienen un checkbox name="test-drive" ("Tenho interesse em realizar um test-drive"). Para que NO se tilde, agregas al Excel una columna con encabezado test-drive y en la celda de ese lead escribis NO.</w:t>
+      </w:r>
+    </w:p>
+    <w:p>
+      <w:pPr>
+        <w:pStyle w:val="ListBullet"/>
+      </w:pPr>
+      <w:r>
+        <w:t>Es por fila: podes tener un lead con el test-drive tildado y otro sin el.</w:t>
+      </w:r>
+    </w:p>
+    <w:p>
+      <w:pPr>
+        <w:pStyle w:val="ListBullet"/>
+      </w:pPr>
+      <w:r>
+        <w:t>Valores aceptados: SI / NO, YES / NO, TRUE / FALSE, 1 / 0, X.</w:t>
+      </w:r>
+    </w:p>
+    <w:p>
+      <w:pPr>
+        <w:pStyle w:val="ListBullet"/>
+      </w:pPr>
+      <w:r>
+        <w:t>Si la columna no corresponde a ningun checkbox del formulario, se ignora sola (no rompe nada).</w:t>
+      </w:r>
+    </w:p>
+    <w:p>
+      <w:pPr>
+        <w:pStyle w:val="ListBullet"/>
+      </w:pPr>
+      <w:r>
+        <w:t>Un SI tilda el checkbox aunque no sea obligatorio; un NO lo destilda y evita que la app lo vuelva a marcar antes de enviar.</w:t>
+      </w:r>
+    </w:p>
+    <w:p>
+      <w:pPr>
+        <w:pStyle w:val="ListBullet"/>
+      </w:pPr>
+      <w:r>
+        <w:t>Funciona en todos los dispositivos: Chrome, Firefox, Edge, Mac LT y Android LT.</w:t>
+      </w:r>
+    </w:p>
+    <w:p>
+      <w:pPr>
+        <w:pStyle w:val="ListBullet"/>
+      </w:pPr>
+      <w:r>
+        <w:t>No hace falta recompilar el portable: los Excels viven en la carpeta data/, afuera del .exe.</w:t>
+      </w:r>
+    </w:p>
+    <w:p>
+      <w:r>
+        <w:rPr>
+          <w:b/>
+        </w:rPr>
+        <w:t xml:space="preserve">Importante: </w:t>
+      </w:r>
+      <w:r>
+        <w:t>Solo aplica a checkboxes. Para campos de texto o selects el Excel funciona distinto: la columna se mapea al campo por el nombre del campo o por el id del HTML, pero el campo tiene que estar declarado en el field_mapping del pais (json/fixed_field_mappings.json). Si queres que un campo se llene siempre con un valor fijo sin tocar el Excel, usa json/ids_dinamicos.json.</w:t>
       </w:r>
     </w:p>
     <w:p>

</xml_diff>

<commit_message>
LambdaTest no saca capturas: la evidencia es el video de la sesion
Android LT sacaba capturas (landing, errores, cada paso, form completado, TY) contra un
dispositivo real: cada una es un round-trip lento y no muestra nada que el video de la
sesion no muestre. Mac LT ya funcionaba asi (nunca paso un screenshot_manager).

- lt_android_runner: screenshot_manager = None siempre. Se sacan el import de
  LTScreenshotManager, la lista _all_screenshot_managers, la descarga al cerrar y el
  screenshots_dir, que quedaban sin uso. El flag with_screenshots se conserva en
  LTAndroidRunOptions (lo pasa el controller) pero queda documentado como ignorado.
- La evidencia sigue siendo la columna "Video LT" del Excel de resultados.
- README y Guia de Uso: se aclara que las capturas son solo de los navegadores locales.

Verificado en Android LT (raq): Thank You confirmada, sin una sola captura, y el lead
bajo de 223s a 160s.
</commit_message>
<xml_diff>
--- a/Guia_de_Uso_Osocio.docx
+++ b/Guia_de_Uso_Osocio.docx
@@ -1224,6 +1224,17 @@
           <w:color w:val="555555"/>
         </w:rPr>
         <w:t>.</w:t>
+      </w:r>
+    </w:p>
+    <w:p>
+      <w:r>
+        <w:rPr>
+          <w:b/>
+        </w:rPr>
+        <w:t xml:space="preserve">Capturas: solo en los navegadores locales. </w:t>
+      </w:r>
+      <w:r>
+        <w:t>Chrome, Firefox y Edge guardan las capturas de cada lead (landing, formulario completado, Thank You) en la carpeta resultados/. Mac LT y Android LT NO sacan capturas: la evidencia es el video completo de la sesion, que se abre desde la columna "Video LT" del Excel de resultados. Cada captura contra un dispositivo real es lenta y no muestra nada que el video no muestre, asi que la casilla "Adjuntar screenshots" no aplica a LambdaTest.</w:t>
       </w:r>
     </w:p>
     <w:p>

</xml_diff>

<commit_message>
Feature: boton IDs Dinamicos en Envio de Leads (nueva UI) + tab Campos detectados
- Nuevo modulo interface/ids_dinamicos_ui.py: popup reutilizable con 4 solapas
  (Campos detectados, IDs unicos, IDs Excel, Dependencias)
- Campos detectados: lista los campos nuevos de nuevos_campos_<pais>.json y
  permite asignarles valor(es) desde la UI; varios valores con | rotan random
- Boton ambar destacado arriba a la derecha de Envio de Leads
- README y Guia de Uso actualizados con capturas nuevas
</commit_message>
<xml_diff>
--- a/Guia_de_Uso_Osocio.docx
+++ b/Guia_de_Uso_Osocio.docx
@@ -5725,6 +5725,172 @@
       </w:r>
       <w:r>
         <w:t xml:space="preserve"> en la pestaña Envío de Leads, ver arriba).</w:t>
+      </w:r>
+    </w:p>
+    <w:p>
+      <w:pPr>
+        <w:pStyle w:val="Heading2"/>
+      </w:pPr>
+      <w:r>
+        <w:t>IDs Dinámicos en Envío de Leads (nuevo)</w:t>
+      </w:r>
+    </w:p>
+    <w:p>
+      <w:r>
+        <w:t>Arriba a la derecha de la pestaña Envío de Leads hay un botón amarillo "⚙ IDs Dinámicos" (debajo de Configurar). Abre un popup para dar de alta y administrar campos no mapeados desde la interfaz, sin editar json/ids_dinamicos.json a mano.</w:t>
+      </w:r>
+    </w:p>
+    <w:p/>
+    <w:p>
+      <w:r>
+        <w:drawing>
+          <wp:inline xmlns:a="http://schemas.openxmlformats.org/drawingml/2006/main" xmlns:pic="http://schemas.openxmlformats.org/drawingml/2006/picture">
+            <wp:extent cx="5760720" cy="3094248"/>
+            <wp:docPr id="20" name="Picture 20"/>
+            <wp:cNvGraphicFramePr>
+              <a:graphicFrameLocks noChangeAspect="1"/>
+            </wp:cNvGraphicFramePr>
+            <a:graphic>
+              <a:graphicData uri="http://schemas.openxmlformats.org/drawingml/2006/picture">
+                <pic:pic>
+                  <pic:nvPicPr>
+                    <pic:cNvPr id="0" name="01_envio_de_leads.png"/>
+                    <pic:cNvPicPr/>
+                  </pic:nvPicPr>
+                  <pic:blipFill>
+                    <a:blip r:embed="rId28"/>
+                    <a:stretch>
+                      <a:fillRect/>
+                    </a:stretch>
+                  </pic:blipFill>
+                  <pic:spPr>
+                    <a:xfrm>
+                      <a:off x="0" y="0"/>
+                      <a:ext cx="5760720" cy="3094248"/>
+                    </a:xfrm>
+                    <a:prstGeom prst="rect"/>
+                  </pic:spPr>
+                </pic:pic>
+              </a:graphicData>
+            </a:graphic>
+          </wp:inline>
+        </w:drawing>
+      </w:r>
+    </w:p>
+    <w:p>
+      <w:pPr>
+        <w:pStyle w:val="Heading3"/>
+      </w:pPr>
+      <w:r>
+        <w:t>Solapa: Campos detectados</w:t>
+      </w:r>
+    </w:p>
+    <w:p>
+      <w:r>
+        <w:t>Lista los campos nuevos que la automatización encontró en los formularios durante las corridas (los registrados en json/nuevos_campos_&lt;país&gt;.json). Elegís el país, ves cada campo con su label, ID real, tipo y si es requerido, y le asignás un valor con el botón "Asignar valor". Si ya tenía valor, lo pre-carga y lo marca con ✔.</w:t>
+      </w:r>
+    </w:p>
+    <w:p>
+      <w:r>
+        <w:t>Varios valores con rotación aleatoria: podés cargar más de un valor separándolos con " | " (ej: rojo | azul | verde). En cada envío la app elige uno al azar, así el campo no se llena siempre igual. Aplica a campos de texto y dropdowns.</w:t>
+      </w:r>
+    </w:p>
+    <w:p>
+      <w:r>
+        <w:drawing>
+          <wp:inline xmlns:a="http://schemas.openxmlformats.org/drawingml/2006/main" xmlns:pic="http://schemas.openxmlformats.org/drawingml/2006/picture">
+            <wp:extent cx="5760720" cy="4055644"/>
+            <wp:docPr id="21" name="Picture 21"/>
+            <wp:cNvGraphicFramePr>
+              <a:graphicFrameLocks noChangeAspect="1"/>
+            </wp:cNvGraphicFramePr>
+            <a:graphic>
+              <a:graphicData uri="http://schemas.openxmlformats.org/drawingml/2006/picture">
+                <pic:pic>
+                  <pic:nvPicPr>
+                    <pic:cNvPr id="0" name="20_ids_dinamicos_campos_detectados.png"/>
+                    <pic:cNvPicPr/>
+                  </pic:nvPicPr>
+                  <pic:blipFill>
+                    <a:blip r:embed="rId29"/>
+                    <a:stretch>
+                      <a:fillRect/>
+                    </a:stretch>
+                  </pic:blipFill>
+                  <pic:spPr>
+                    <a:xfrm>
+                      <a:off x="0" y="0"/>
+                      <a:ext cx="5760720" cy="4055644"/>
+                    </a:xfrm>
+                    <a:prstGeom prst="rect"/>
+                  </pic:spPr>
+                </pic:pic>
+              </a:graphicData>
+            </a:graphic>
+          </wp:inline>
+        </w:drawing>
+      </w:r>
+    </w:p>
+    <w:p>
+      <w:pPr>
+        <w:pStyle w:val="Heading3"/>
+      </w:pPr>
+      <w:r>
+        <w:t>Solapa: IDs únicos</w:t>
+      </w:r>
+    </w:p>
+    <w:p>
+      <w:r>
+        <w:t>Alta manual de cualquier ID no mapeado con su valor (o varios, con " | "), descripción opcional y países donde aplica (sin tildar = todos). Abajo se listan los configurados, con filtro por texto y país, y botones Editar / ✕ por fila.</w:t>
+      </w:r>
+    </w:p>
+    <w:p>
+      <w:r>
+        <w:drawing>
+          <wp:inline xmlns:a="http://schemas.openxmlformats.org/drawingml/2006/main" xmlns:pic="http://schemas.openxmlformats.org/drawingml/2006/picture">
+            <wp:extent cx="5760720" cy="4055644"/>
+            <wp:docPr id="22" name="Picture 22"/>
+            <wp:cNvGraphicFramePr>
+              <a:graphicFrameLocks noChangeAspect="1"/>
+            </wp:cNvGraphicFramePr>
+            <a:graphic>
+              <a:graphicData uri="http://schemas.openxmlformats.org/drawingml/2006/picture">
+                <pic:pic>
+                  <pic:nvPicPr>
+                    <pic:cNvPr id="0" name="21_ids_dinamicos_ids_unicos.png"/>
+                    <pic:cNvPicPr/>
+                  </pic:nvPicPr>
+                  <pic:blipFill>
+                    <a:blip r:embed="rId30"/>
+                    <a:stretch>
+                      <a:fillRect/>
+                    </a:stretch>
+                  </pic:blipFill>
+                  <pic:spPr>
+                    <a:xfrm>
+                      <a:off x="0" y="0"/>
+                      <a:ext cx="5760720" cy="4055644"/>
+                    </a:xfrm>
+                    <a:prstGeom prst="rect"/>
+                  </pic:spPr>
+                </pic:pic>
+              </a:graphicData>
+            </a:graphic>
+          </wp:inline>
+        </w:drawing>
+      </w:r>
+    </w:p>
+    <w:p>
+      <w:pPr>
+        <w:pStyle w:val="Heading3"/>
+      </w:pPr>
+      <w:r>
+        <w:t>Solapas: IDs Excel y Dependencias</w:t>
+      </w:r>
+    </w:p>
+    <w:p>
+      <w:r>
+        <w:t>IDs Excel: el mapping fijo por país (campos que se llenan desde columnas del Excel). Permite ver, agregar, editar o borrar entradas y ajustar el data_index, mostrando en vivo a qué columna del Excel corresponde. Dependencias: registrá qué ID hijo depende de un ID padre por país, para que la app los llene en orden.</w:t>
       </w:r>
     </w:p>
     <w:sectPr>

</xml_diff>

<commit_message>
IDs Dinamicos: valores multiples por chips + scroll fix + aviso de campos sin valor
- Campos detectados: cada valor se añade/quita individualmente (chips con X);
  varios valores por ID rotan al azar en cada envio
- Scroll con ruedita funciona en todo el popup (antes solo sobre la barra
  y scrolleaba la ventana de atras)
- Corridas con campos requeridos sin valor asignado ahora dan FAIL en el
  Excel de resultados y se reportan como error en el mail
- Campos opcionales que quedan vacios: aviso en columna Resultado y seccion
  'CAMPOS SIN VALOR ASIGNADO' en el mail (simple y consolidado)
- README y Guia actualizados con capturas nuevas de la UI de chips
</commit_message>
<xml_diff>
--- a/Guia_de_Uso_Osocio.docx
+++ b/Guia_de_Uso_Osocio.docx
@@ -5732,15 +5732,14 @@
         <w:pStyle w:val="Heading2"/>
       </w:pPr>
       <w:r>
-        <w:t>IDs Dinámicos en Envío de Leads (nuevo)</w:t>
+        <w:t>IDs Dinámicos en Envío de Leads</w:t>
       </w:r>
     </w:p>
     <w:p>
       <w:r>
-        <w:t>Arriba a la derecha de la pestaña Envío de Leads hay un botón amarillo "⚙ IDs Dinámicos" (debajo de Configurar). Abre un popup para dar de alta y administrar campos no mapeados desde la interfaz, sin editar json/ids_dinamicos.json a mano.</w:t>
+        <w:t>Arriba a la derecha de la pestaña Envío de Leads hay un botón amarillo "⚙ IDs Dinámicos" (debajo de Configurar). Abre un popup para dar de alta y administrar campos no mapeados desde la interfaz, sin editar json/ids_dinamicos.json a mano. La ruedita del mouse scrollea la lista de la solapa activa desde cualquier parte del popup.</w:t>
       </w:r>
     </w:p>
-    <w:p/>
     <w:p>
       <w:r>
         <w:drawing>
@@ -5782,17 +5781,32 @@
         <w:pStyle w:val="Heading3"/>
       </w:pPr>
       <w:r>
-        <w:t>Solapa: Campos detectados</w:t>
+        <w:t>Solapa Campos detectados</w:t>
       </w:r>
     </w:p>
     <w:p>
       <w:r>
-        <w:t>Lista los campos nuevos que la automatización encontró en los formularios durante las corridas (los registrados en json/nuevos_campos_&lt;país&gt;.json). Elegís el país, ves cada campo con su label, ID real, tipo y si es requerido, y le asignás un valor con el botón "Asignar valor". Si ya tenía valor, lo pre-carga y lo marca con ✔.</w:t>
+        <w:t>Muestra los campos nuevos que la automatización encontró en los formularios durante las corridas. Elegís el país y ves cada campo con su label, ID real, tipo y si es requerido.</w:t>
       </w:r>
     </w:p>
     <w:p>
       <w:r>
-        <w:t>Varios valores con rotación aleatoria: podés cargar más de un valor separándolos con " | " (ej: rojo | azul | verde). En cada envío la app elige uno al azar, así el campo no se llena siempre igual. Aplica a campos de texto y dropdowns.</w:t>
+        <w:t>• Añadir un valor: escribí en el cuadro y apretá "➕ Añadir valor" (o Enter). Cada valor queda como una etiqueta al lado de "Valores:".</w:t>
+      </w:r>
+    </w:p>
+    <w:p>
+      <w:r>
+        <w:t>• Varios valores = rotación aleatoria: repetí "Añadir valor" las veces que quieras. En cada envío la app elige uno al azar, así el campo no se llena siempre igual. Aplica a campos de texto y a dropdowns.</w:t>
+      </w:r>
+    </w:p>
+    <w:p>
+      <w:r>
+        <w:t>• Quitar un valor: click en la ✕ de su etiqueta. Si quitás todos, el campo queda sin valor asignado.</w:t>
+      </w:r>
+    </w:p>
+    <w:p>
+      <w:r>
+        <w:t>• Todo se guarda como IDs únicos para ese país.</w:t>
       </w:r>
     </w:p>
     <w:p>
@@ -5836,12 +5850,12 @@
         <w:pStyle w:val="Heading3"/>
       </w:pPr>
       <w:r>
-        <w:t>Solapa: IDs únicos</w:t>
+        <w:t>Solapa IDs únicos</w:t>
       </w:r>
     </w:p>
     <w:p>
       <w:r>
-        <w:t>Alta manual de cualquier ID no mapeado con su valor (o varios, con " | "), descripción opcional y países donde aplica (sin tildar = todos). Abajo se listan los configurados, con filtro por texto y país, y botones Editar / ✕ por fila.</w:t>
+        <w:t>Alta manual de cualquier ID no mapeado: escribís el ID, su valor (o varios separados con " | "), descripción opcional y países donde aplica (sin tildar = todos). Abajo se listan los configurados, con filtro por texto y país, y botones Editar / ✕ por fila.</w:t>
       </w:r>
     </w:p>
     <w:p>
@@ -5885,12 +5899,25 @@
         <w:pStyle w:val="Heading3"/>
       </w:pPr>
       <w:r>
-        <w:t>Solapas: IDs Excel y Dependencias</w:t>
+        <w:t>Solapas IDs Excel y Dependencias</w:t>
       </w:r>
     </w:p>
     <w:p>
       <w:r>
         <w:t>IDs Excel: el mapping fijo por país (campos que se llenan desde columnas del Excel). Permite ver, agregar, editar o borrar entradas y ajustar el data_index, mostrando en vivo a qué columna del Excel corresponde. Dependencias: registrá qué ID hijo depende de un ID padre por país, para que la app los llene en orden.</w:t>
+      </w:r>
+    </w:p>
+    <w:p>
+      <w:pPr>
+        <w:pStyle w:val="Heading3"/>
+      </w:pPr>
+      <w:r>
+        <w:t>Aviso de campos sin valor al enviar</w:t>
+      </w:r>
+    </w:p>
+    <w:p>
+      <w:r>
+        <w:t>Cuando una corrida no puede completar campos porque no tienen valor asignado, la app avisa: si son campos requeridos, la fila cuenta como FAIL en el Excel de resultados (columna Resultado: "Campos sin completar (sin valor asignado): …") y aparece como error en el mail. Si son campos opcionales que quedaron vacíos, la fila sigue PASS pero la columna Resultado suma el aviso y el mail incluye la sección "CAMPOS SIN VALOR ASIGNADO" con línea y campos. En ambos casos la solución es abrir ⚙ IDs Dinámicos → Campos detectados y asignarles valor(es).</w:t>
       </w:r>
     </w:p>
     <w:sectPr>

</xml_diff>

<commit_message>
IDs Dinamicos: boton Listo, chips en IDs unicos y checkboxes SI/NO
- Campos detectados: boton '✔ Listo' por campo — lo saca de la lista (queda
  limpia) y sigue editable desde IDs unicos
- IDs unicos: valores multiples con ➕ y etiquetas con ✕ (mismo UX que
  Campos detectados); rotacion aleatoria entre valores
- Checkboxes: un ID dinamico con valor SI/NO marca o desmarca el checkbox
  (mismos valores que el Excel; la columna del Excel tiene prioridad);
  con SI y NO cargados sortea por fila
- README y Guia actualizados con capturas nuevas
</commit_message>
<xml_diff>
--- a/Guia_de_Uso_Osocio.docx
+++ b/Guia_de_Uso_Osocio.docx
@@ -5791,22 +5791,22 @@
     </w:p>
     <w:p>
       <w:r>
-        <w:t>• Añadir un valor: escribí en el cuadro y apretá "➕ Añadir valor" (o Enter). Cada valor queda como una etiqueta al lado de "Valores:".</w:t>
+        <w:t>• Añadir un valor: escribí en el cuadro y apretá "➕ Añadir valor" (o Enter). Cada valor se guarda al instante y queda como una etiqueta al lado de "Valores:".</w:t>
       </w:r>
     </w:p>
     <w:p>
       <w:r>
-        <w:t>• Varios valores = rotación aleatoria: repetí "Añadir valor" las veces que quieras. En cada envío la app elige uno al azar, así el campo no se llena siempre igual. Aplica a campos de texto y a dropdowns.</w:t>
+        <w:t>• Varios valores = rotación aleatoria: repetí "Añadir valor" las veces que quieras. En cada envío la app elige uno al azar, así el campo no se llena siempre igual. Si cargás uno solo, usa siempre ese.</w:t>
       </w:r>
     </w:p>
     <w:p>
       <w:r>
-        <w:t>• Quitar un valor: click en la ✕ de su etiqueta. Si quitás todos, el campo queda sin valor asignado.</w:t>
+        <w:t>• Quitar un valor: click en la ✕ de su etiqueta.</w:t>
       </w:r>
     </w:p>
     <w:p>
       <w:r>
-        <w:t>• Todo se guarda como IDs únicos para ese país.</w:t>
+        <w:t>• ✔ Listo: cuando terminás con un campo, lo saca de esta lista para que quede limpia. Sus valores no se pierden: quedan en la solapa IDs únicos y de ahí en más se editan desde allá.</w:t>
       </w:r>
     </w:p>
     <w:p>
@@ -5855,7 +5855,7 @@
     </w:p>
     <w:p>
       <w:r>
-        <w:t>Alta manual de cualquier ID no mapeado: escribís el ID, su valor (o varios separados con " | "), descripción opcional y países donde aplica (sin tildar = todos). Abajo se listan los configurados, con filtro por texto y país, y botones Editar / ✕ por fila.</w:t>
+        <w:t>Alta manual de cualquier ID no mapeado: escribís el ID, la descripción opcional y los países donde aplica (sin tildar = todos). En Valor podés cargar varios: escribí uno y apretá ➕ (o Enter) — queda como etiqueta y se elige uno al azar en cada envío. Abajo se listan los configurados, con filtro por texto y país, y botones Editar / ✕ por fila.</w:t>
       </w:r>
     </w:p>
     <w:p>
@@ -5892,6 +5892,19 @@
             </a:graphic>
           </wp:inline>
         </w:drawing>
+      </w:r>
+    </w:p>
+    <w:p>
+      <w:pPr>
+        <w:pStyle w:val="Heading3"/>
+      </w:pPr>
+      <w:r>
+        <w:t>Checkboxes con SI/NO</w:t>
+      </w:r>
+    </w:p>
+    <w:p>
+      <w:r>
+        <w:t>Para un checkbox opcional (ej. test-drive, newsletter), cargá su ID con valor SI o NO — los mismos valores que acepta el Excel (si/no, yes/1/0, marcar/desmarcar). La app lo marca o lo deja sin marcar en cada envío. Si le cargás SI y NO como dos valores, sortea entre marcar y no marcar por fila. La columna del Excel, si existe, tiene prioridad.</w:t>
       </w:r>
     </w:p>
     <w:p>

</xml_diff>

<commit_message>
Guia de Uso: novedades del Comparador de Dealers (email, estados, evidencia, Editar, modal, Detener)
</commit_message>
<xml_diff>
--- a/Guia_de_Uso_Osocio.docx
+++ b/Guia_de_Uso_Osocio.docx
@@ -5931,6 +5931,220 @@
     <w:p>
       <w:r>
         <w:t>Cuando una corrida no puede completar campos porque no tienen valor asignado, la app avisa: si son campos requeridos, la fila cuenta como FAIL en el Excel de resultados (columna Resultado: "Campos sin completar (sin valor asignado): …") y aparece como error en el mail. Si son campos opcionales que quedaron vacíos, la fila sigue PASS pero la columna Resultado suma el aviso y el mail incluye la sección "CAMPOS SIN VALOR ASIGNADO" con línea y campos. En ambos casos la solución es abrir ⚙ IDs Dinámicos → Campos detectados y asignarles valor(es).</w:t>
+      </w:r>
+    </w:p>
+    <w:p>
+      <w:pPr>
+        <w:pStyle w:val="Heading2"/>
+      </w:pPr>
+      <w:r>
+        <w:t>Comparar Dealers vs Form — novedades</w:t>
+      </w:r>
+    </w:p>
+    <w:p>
+      <w:r>
+        <w:t>La pestaña Comparar Dealers vs Form chequea que los concesionarios de una marca estén bien cargados en un formulario real, comparando contra un Excel de dealers. Todo se valida en conjunto (Región → Ciudad → Dealer): un mismo nombre en otra provincia no genera falsos positivos. Sigue una mini-guía numerada ①→⑤ arriba de EJECUTAR.</w:t>
+      </w:r>
+    </w:p>
+    <w:p>
+      <w:r>
+        <w:drawing>
+          <wp:inline xmlns:a="http://schemas.openxmlformats.org/drawingml/2006/main" xmlns:pic="http://schemas.openxmlformats.org/drawingml/2006/picture">
+            <wp:extent cx="5760720" cy="3094248"/>
+            <wp:docPr id="23" name="Picture 23"/>
+            <wp:cNvGraphicFramePr>
+              <a:graphicFrameLocks noChangeAspect="1"/>
+            </wp:cNvGraphicFramePr>
+            <a:graphic>
+              <a:graphicData uri="http://schemas.openxmlformats.org/drawingml/2006/picture">
+                <pic:pic>
+                  <pic:nvPicPr>
+                    <pic:cNvPr id="0" name="30_dealers_tab_top.png"/>
+                    <pic:cNvPicPr/>
+                  </pic:nvPicPr>
+                  <pic:blipFill>
+                    <a:blip r:embed="rId31"/>
+                    <a:stretch>
+                      <a:fillRect/>
+                    </a:stretch>
+                  </pic:blipFill>
+                  <pic:spPr>
+                    <a:xfrm>
+                      <a:off x="0" y="0"/>
+                      <a:ext cx="5760720" cy="3094248"/>
+                    </a:xfrm>
+                    <a:prstGeom prst="rect"/>
+                  </pic:spPr>
+                </pic:pic>
+              </a:graphicData>
+            </a:graphic>
+          </wp:inline>
+        </w:drawing>
+      </w:r>
+    </w:p>
+    <w:p>
+      <w:r>
+        <w:drawing>
+          <wp:inline xmlns:a="http://schemas.openxmlformats.org/drawingml/2006/main" xmlns:pic="http://schemas.openxmlformats.org/drawingml/2006/picture">
+            <wp:extent cx="5760720" cy="3094248"/>
+            <wp:docPr id="24" name="Picture 24"/>
+            <wp:cNvGraphicFramePr>
+              <a:graphicFrameLocks noChangeAspect="1"/>
+            </wp:cNvGraphicFramePr>
+            <a:graphic>
+              <a:graphicData uri="http://schemas.openxmlformats.org/drawingml/2006/picture">
+                <pic:pic>
+                  <pic:nvPicPr>
+                    <pic:cNvPr id="0" name="31_dealers_tab_mid.png"/>
+                    <pic:cNvPicPr/>
+                  </pic:nvPicPr>
+                  <pic:blipFill>
+                    <a:blip r:embed="rId32"/>
+                    <a:stretch>
+                      <a:fillRect/>
+                    </a:stretch>
+                  </pic:blipFill>
+                  <pic:spPr>
+                    <a:xfrm>
+                      <a:off x="0" y="0"/>
+                      <a:ext cx="5760720" cy="3094248"/>
+                    </a:xfrm>
+                    <a:prstGeom prst="rect"/>
+                  </pic:spPr>
+                </pic:pic>
+              </a:graphicData>
+            </a:graphic>
+          </wp:inline>
+        </w:drawing>
+      </w:r>
+    </w:p>
+    <w:p>
+      <w:pPr>
+        <w:pStyle w:val="Heading3"/>
+      </w:pPr>
+      <w:r>
+        <w:t>Filtro e Incluir / Excluir</w:t>
+      </w:r>
+    </w:p>
+    <w:p>
+      <w:r>
+        <w:t>Con "Tiene columna de filtro" definís Columna filtro (nombre o letra, ej. K), Valor filtro (ej. No) y la Condición: Incluir = esos dealers DEBEN estar en el form; Excluir = NO deben estar (se verifica la ausencia). Con "No tiene filtro" se compara todo el Excel contra el form, con la misma lógica de conjunto.</w:t>
+      </w:r>
+    </w:p>
+    <w:p>
+      <w:pPr>
+        <w:pStyle w:val="Heading3"/>
+      </w:pPr>
+      <w:r>
+        <w:t>Estados del reporte (colores en el Excel)</w:t>
+      </w:r>
+    </w:p>
+    <w:p>
+      <w:r>
+        <w:t>• PASS (verde): está como debe (o correctamente ausente en Excluir).</w:t>
+      </w:r>
+    </w:p>
+    <w:p>
+      <w:r>
+        <w:t>• FAIL (rojo): no está cuando debía (Incluir) o está cuando no debía (Excluir).</w:t>
+      </w:r>
+    </w:p>
+    <w:p>
+      <w:r>
+        <w:t>• EXTRA (amarillo): aparece en el form pero no está declarado en el Excel para esa combinación.</w:t>
+      </w:r>
+    </w:p>
+    <w:p>
+      <w:r>
+        <w:t>• DUPLICADO (naranja claro): aparece más de una vez en el mismo dropdown del form.</w:t>
+      </w:r>
+    </w:p>
+    <w:p>
+      <w:r>
+        <w:t>• OCULTO (naranja): está en el form pero declarado solo en filas ocultas del Excel. Todo lo relacionado con filas/columnas ocultas se marca en naranja.</w:t>
+      </w:r>
+    </w:p>
+    <w:p>
+      <w:r>
+        <w:t>• NOTA (celeste): mismo dealer, el nombre difiere solo en detalles menores (mayúsculas, apóstrofes/comillas, guiones, paréntesis, sufijos como (1000km)). Cuenta como OK, con disclaimer en la columna "Nota Nombre".</w:t>
+      </w:r>
+    </w:p>
+    <w:p>
+      <w:pPr>
+        <w:pStyle w:val="Heading3"/>
+      </w:pPr>
+      <w:r>
+        <w:t>Nombres con caracteres especiales</w:t>
+      </w:r>
+    </w:p>
+    <w:p>
+      <w:r>
+        <w:t>El matching tolera diferencias de puntuación y espaciado: DANTE D'AMICO S.A. - MATADEROS matchea con DANTE D AMICO S.A. – MATADEROS, y HCH S.A. - RPM con HCH S.A. (RPM). Cuentan como PASS con NOTA. Lo que sí da error es contenido de más o de menos (ej. Pepito vs Pepito Hernández).</w:t>
+      </w:r>
+    </w:p>
+    <w:p>
+      <w:pPr>
+        <w:pStyle w:val="Heading3"/>
+      </w:pPr>
+      <w:r>
+        <w:t>Evidencia de exclusión (modo Excluir + capturas)</w:t>
+      </w:r>
+    </w:p>
+    <w:p>
+      <w:r>
+        <w:t>Para probar que un dealer NO está, la app despliega el dropdown correspondiente dentro del form (convierte el select en lista abierta, ya que el popup nativo no es fotografiable) y saca la captura. Se abre el primer nivel de la cadena que falta: si la región no está → dropdown de Regiones; si la región está pero la ciudad no → dropdown de Ciudades; si ambas están y el dealer no → dropdown de Dealers. Si el dealer está cuando no debía, aparece resaltado en amarillo. Cada captura lleva arriba un banner conciso: URL landing, URL form, Revisado (Región · Ciudad · Dealer) y Estado (PASS/FAIL con el motivo).</w:t>
+      </w:r>
+    </w:p>
+    <w:p>
+      <w:pPr>
+        <w:pStyle w:val="Heading3"/>
+      </w:pPr>
+      <w:r>
+        <w:t>Enviar resultados por email</w:t>
+      </w:r>
+    </w:p>
+    <w:p>
+      <w:r>
+        <w:t>Tildá "Enviar mail al terminar" y poné el destinatario (mismo campo global que Envío de Leads). Al terminar cada form manda un mail con su reporte: adjunta la carpeta completa (Excel + capturas) en un ZIP si elegiste "Excel + Capturas", o solo el Excel si elegiste "Solo Excel". El cuerpo trae el resumen PASS/FAIL/EXTRA/DUPLICADO/OCULTO/NOTA.</w:t>
+      </w:r>
+    </w:p>
+    <w:p>
+      <w:pPr>
+        <w:pStyle w:val="Heading3"/>
+      </w:pPr>
+      <w:r>
+        <w:t>Configuraciones guardadas (con Editar)</w:t>
+      </w:r>
+    </w:p>
+    <w:p>
+      <w:r>
+        <w:t>Guardar configuración crea una nueva (pregunta antes de sobrescribir). Cargar aplica el preset y copia su nombre al campo Nombre. Editar reescribe el preset seleccionado con los valores actuales y, si cambiaste el Nombre, lo renombra. Eliminar borra el preset (con confirmación).</w:t>
+      </w:r>
+    </w:p>
+    <w:p>
+      <w:pPr>
+        <w:pStyle w:val="Heading3"/>
+      </w:pPr>
+      <w:r>
+        <w:t>El modal del Comparador</w:t>
+      </w:r>
+    </w:p>
+    <w:p>
+      <w:r>
+        <w:t>La corrida abre un modal que bloquea la ventana de atrás. La línea de estado muestra la combinación exacta en curso (Región: X · Ciudad: Y · Dealer: Z), form por form. El resumen final muestra PASS/FAIL grande, más EXTRA/DUPLICADO/OCULTO/NOTA si los hay, el total chequeado y un veredicto. El botón Detener pide confirmación antes de cortar (igual que la X de cerrar). Como el Excel se guarda al terminar la Fase 1 de cada form, si frenás en la Fase 2 (capturas) el reporte igual queda. Cada form deja su propia carpeta país_form_columna(o sinfiltro)_incluidos|excluidos_timestamp dentro de Dealerscheck_resultados.</w:t>
+      </w:r>
+    </w:p>
+    <w:p>
+      <w:pPr>
+        <w:pStyle w:val="Heading3"/>
+      </w:pPr>
+      <w:r>
+        <w:t>Detener en cualquier ejecución</w:t>
+      </w:r>
+    </w:p>
+    <w:p>
+      <w:r>
+        <w:t>En el modal de ejecución de todas las pestañas, el botón Detener ahora hace lo mismo que la X de cerrar: dispara un popup de confirmación antes de cortar el proceso.</w:t>
       </w:r>
     </w:p>
     <w:sectPr>

</xml_diff>

<commit_message>
Docs: forms multi-paso, campo Modelo auto, y filas ocultas vs filtradas en el Comparador
README y Guia de Uso: documentado que el Comparador funciona con forms de 1/2/3 pasos
(avanza completando lo requerido hasta el nivel mas alto seleccionado), cuando conviene
tildar 'Tiene selector de Modelo' (solo si los dealers dependen del modelo; si no, elige
uno solo para avanzar), y la distincion filas Filtradas (AutoFilter) vs Ocultas (a mano).
</commit_message>
<xml_diff>
--- a/Guia_de_Uso_Osocio.docx
+++ b/Guia_de_Uso_Osocio.docx
@@ -6145,6 +6145,58 @@
     <w:p>
       <w:r>
         <w:t>En el modal de ejecución de todas las pestañas, el botón Detener ahora hace lo mismo que la X de cerrar: dispara un popup de confirmación antes de cortar el proceso.</w:t>
+      </w:r>
+    </w:p>
+    <w:p>
+      <w:pPr>
+        <w:pStyle w:val="Heading2"/>
+      </w:pPr>
+      <w:r>
+        <w:t>Comparador de Dealers — formularios multi-paso y filas no visibles</w:t>
+      </w:r>
+    </w:p>
+    <w:p>
+      <w:pPr>
+        <w:pStyle w:val="Heading3"/>
+      </w:pPr>
+      <w:r>
+        <w:t>Funciona con formularios de 1, 2 o 3 pasos</w:t>
+      </w:r>
+    </w:p>
+    <w:p>
+      <w:r>
+        <w:t>Si los dropdowns region/city/dealer están en el primer paso, el comparador los usa al instante. Si el formulario es multi-paso (los dropdowns aparecen más adelante), avanza los pasos igual que Envío de Leads: completa los campos requeridos de cada paso con valores sintéticos (selects: primera opción válida; textos: dato dummy; checkboxes y radios: los marca), SIN tocar region/city/dealer, aprieta Siguiente/Next, y recién empieza a comparar cuando aparece el nivel más alto que elegiste (region si la activaste, si no city, si no dealer). Nunca envía el formulario. Si el form se traba por un campo requerido que no reconoce, lo detecta y corta en vez de quedar en loop.</w:t>
+      </w:r>
+    </w:p>
+    <w:p>
+      <w:r>
+        <w:t>Importante: activá solo los niveles que el formulario realmente tiene. Si un form tiene city + dealer pero no region, dejá region apagado; si no, cada fila fallará buscando una región inexistente.</w:t>
+      </w:r>
+    </w:p>
+    <w:p>
+      <w:pPr>
+        <w:pStyle w:val="Heading3"/>
+      </w:pPr>
+      <w:r>
+        <w:t>Campo Modelo</w:t>
+      </w:r>
+    </w:p>
+    <w:p>
+      <w:r>
+        <w:t>Tildá 'Tiene selector de Modelo' SOLO si la lista de dealers cambia según el modelo: en ese caso el comparador repite la revisión de dealers para cada modelo (Todos los modelos o específicos). Si los dealers son los mismos sin importar el modelo, dejalo destildado: al avanzar el form, si hay un dropdown de modelo, el comparador elige la primera opción válida solo para pasar de paso (y si ya viene uno preseleccionado, lo respeta). No hace falta tildarlo solo para que avance.</w:t>
+      </w:r>
+    </w:p>
+    <w:p>
+      <w:pPr>
+        <w:pStyle w:val="Heading3"/>
+      </w:pPr>
+      <w:r>
+        <w:t>Filas que no se ven: ocultas vs filtradas</w:t>
+      </w:r>
+    </w:p>
+    <w:p>
+      <w:r>
+        <w:t>El Excel a veces viene con filas que no se ven. La app distingue las dos causas y lo aclara en el reporte: Filtradas = escondidas por un AutoFilter activo (guardaste el Excel con un filtro aplicado; reaparecen si sacás el filtro). Ocultas = escondidas a mano (fila oculta manualmente), sin filtro. En la hoja Resumen del reporte van en secciones separadas con sus números de fila, y en modo Excluir cada fila afectada dice si está FILTRADA (AutoFilter) u OCULTA (a mano). Los filtros de Excel esconden filas, no columnas, así que las columnas que no se ven siempre son ocultas.</w:t>
       </w:r>
     </w:p>
     <w:sectPr>

</xml_diff>

<commit_message>
Docs: reflejar el nuevo indicador de paises con campos detectados
Suma el bullet del resumen por pais (con cantidad) tanto en la guia de
uso (solapa Campos detectados) como en el pptx (slide de IDs Dinamicos),
para que coincidan con el cambio de interface/ids_dinamicos_ui.py.
</commit_message>
<xml_diff>
--- a/Guia_de_Uso_Osocio.docx
+++ b/Guia_de_Uso_Osocio.docx
@@ -5787,6 +5787,11 @@
     <w:p>
       <w:r>
         <w:t>Muestra los campos nuevos que la automatización encontró en los formularios durante las corridas. Elegís el país y ves cada campo con su label, ID real, tipo y si es requerido.</w:t>
+      </w:r>
+    </w:p>
+    <w:p>
+      <w:r>
+        <w:t>• Resumen por país: debajo del selector de país aparece un renglón que lista, sin tener que ir uno por uno, en qué mercados hay campos nuevos pendientes (con la cantidad de cada uno); si no queda ninguno pendiente, avisa que no hay campos nuevos en ningún país.</w:t>
       </w:r>
     </w:p>
     <w:p>

</xml_diff>